<commit_message>
docs: update Task1_DesignMemo.docx and Task1_DesignMemo.md to strict 2-page format with complete technical and design details
</commit_message>
<xml_diff>
--- a/Task1_DesignMemo.docx
+++ b/Task1_DesignMemo.docx
@@ -4,727 +4,2007 @@
   <w:body>
     <w:p>
       <w:pPr>
-        <w:pStyle w:val="Title"/>
+        <w:spacing w:before="0" w:after="20" w:line="260" w:lineRule="exact"/>
         <w:jc w:val="center"/>
       </w:pPr>
       <w:r>
-        <w:t>TASK 1 — DESIGN MEMO</w:t>
+        <w:rPr>
+          <w:rFonts w:ascii="Calibri" w:hAnsi="Calibri"/>
+          <w:b/>
+          <w:i w:val="0"/>
+          <w:color w:val="0F2850"/>
+          <w:sz w:val="36"/>
+        </w:rPr>
+        <w:t>CIPHERFLOW</w:t>
       </w:r>
     </w:p>
     <w:p>
       <w:pPr>
-        <w:pStyle w:val="Heading1"/>
+        <w:spacing w:before="0" w:after="20" w:line="260" w:lineRule="exact"/>
+        <w:jc w:val="center"/>
       </w:pPr>
       <w:r>
-        <w:t>Automation Design Memo: Scaling Security Data Processing</w:t>
+        <w:rPr>
+          <w:rFonts w:ascii="Calibri" w:hAnsi="Calibri"/>
+          <w:b w:val="0"/>
+          <w:i w:val="0"/>
+          <w:color w:val="000000"/>
+          <w:sz w:val="20"/>
+        </w:rPr>
+        <w:t>Security Data Engineering Pipeline  ·  Task 1: Automation Design Memo</w:t>
+      </w:r>
+    </w:p>
+    <w:p>
+      <w:pPr>
+        <w:spacing w:before="60" w:after="60"/>
+        <w:pBdr>
+          <w:bottom w:val="single" w:sz="4" w:space="1" w:color="505050"/>
+        </w:pBdr>
+      </w:pPr>
+    </w:p>
+    <w:tbl>
+      <w:tblPr>
+        <w:tblW w:type="auto" w:w="0"/>
+        <w:jc w:val="center"/>
+        <w:tblLook w:firstColumn="1" w:firstRow="1" w:lastColumn="0" w:lastRow="0" w:noHBand="0" w:noVBand="1" w:val="04A0"/>
+      </w:tblPr>
+      <w:tblGrid>
+        <w:gridCol w:w="2448"/>
+        <w:gridCol w:w="2448"/>
+        <w:gridCol w:w="2448"/>
+        <w:gridCol w:w="2448"/>
+      </w:tblGrid>
+      <w:tr>
+        <w:tc>
+          <w:tcPr>
+            <w:tcW w:type="dxa" w:w="2448"/>
+          </w:tcPr>
+          <w:p>
+            <w:pPr>
+              <w:spacing w:before="20" w:after="20"/>
+            </w:pPr>
+            <w:r>
+              <w:rPr>
+                <w:rFonts w:ascii="Calibri" w:hAnsi="Calibri"/>
+                <w:b/>
+                <w:color w:val="000000"/>
+                <w:sz w:val="19"/>
+              </w:rPr>
+              <w:t>Document Type:</w:t>
+            </w:r>
+          </w:p>
+        </w:tc>
+        <w:tc>
+          <w:tcPr>
+            <w:tcW w:type="dxa" w:w="2448"/>
+          </w:tcPr>
+          <w:p>
+            <w:pPr>
+              <w:spacing w:before="20" w:after="20"/>
+            </w:pPr>
+            <w:r>
+              <w:rPr>
+                <w:rFonts w:ascii="Calibri" w:hAnsi="Calibri"/>
+                <w:b w:val="0"/>
+                <w:color w:val="000000"/>
+                <w:sz w:val="19"/>
+              </w:rPr>
+              <w:t>Design Memo — Task 1 Theoretical</w:t>
+            </w:r>
+          </w:p>
+        </w:tc>
+        <w:tc>
+          <w:tcPr>
+            <w:tcW w:type="dxa" w:w="2448"/>
+          </w:tcPr>
+          <w:p>
+            <w:pPr>
+              <w:spacing w:before="20" w:after="20"/>
+            </w:pPr>
+            <w:r>
+              <w:rPr>
+                <w:rFonts w:ascii="Calibri" w:hAnsi="Calibri"/>
+                <w:b/>
+                <w:color w:val="000000"/>
+                <w:sz w:val="19"/>
+              </w:rPr>
+              <w:t>Date:</w:t>
+            </w:r>
+          </w:p>
+        </w:tc>
+        <w:tc>
+          <w:tcPr>
+            <w:tcW w:type="dxa" w:w="2448"/>
+          </w:tcPr>
+          <w:p>
+            <w:pPr>
+              <w:spacing w:before="20" w:after="20"/>
+            </w:pPr>
+            <w:r>
+              <w:rPr>
+                <w:rFonts w:ascii="Calibri" w:hAnsi="Calibri"/>
+                <w:b w:val="0"/>
+                <w:color w:val="000000"/>
+                <w:sz w:val="19"/>
+              </w:rPr>
+              <w:t>July 26, 2026</w:t>
+            </w:r>
+          </w:p>
+        </w:tc>
+      </w:tr>
+      <w:tr>
+        <w:tc>
+          <w:tcPr>
+            <w:tcW w:type="dxa" w:w="2448"/>
+          </w:tcPr>
+          <w:p>
+            <w:pPr>
+              <w:spacing w:before="20" w:after="20"/>
+            </w:pPr>
+            <w:r>
+              <w:rPr>
+                <w:rFonts w:ascii="Calibri" w:hAnsi="Calibri"/>
+                <w:b/>
+                <w:color w:val="000000"/>
+                <w:sz w:val="19"/>
+              </w:rPr>
+              <w:t>Author:</w:t>
+            </w:r>
+          </w:p>
+        </w:tc>
+        <w:tc>
+          <w:tcPr>
+            <w:tcW w:type="dxa" w:w="2448"/>
+          </w:tcPr>
+          <w:p>
+            <w:pPr>
+              <w:spacing w:before="20" w:after="20"/>
+            </w:pPr>
+            <w:r>
+              <w:rPr>
+                <w:rFonts w:ascii="Calibri" w:hAnsi="Calibri"/>
+                <w:b w:val="0"/>
+                <w:color w:val="000000"/>
+                <w:sz w:val="19"/>
+              </w:rPr>
+              <w:t>MAFA</w:t>
+            </w:r>
+          </w:p>
+        </w:tc>
+        <w:tc>
+          <w:tcPr>
+            <w:tcW w:type="dxa" w:w="2448"/>
+          </w:tcPr>
+          <w:p>
+            <w:pPr>
+              <w:spacing w:before="20" w:after="20"/>
+            </w:pPr>
+            <w:r>
+              <w:rPr>
+                <w:rFonts w:ascii="Calibri" w:hAnsi="Calibri"/>
+                <w:b/>
+                <w:color w:val="000000"/>
+                <w:sz w:val="19"/>
+              </w:rPr>
+              <w:t>Track:</w:t>
+            </w:r>
+          </w:p>
+        </w:tc>
+        <w:tc>
+          <w:tcPr>
+            <w:tcW w:type="dxa" w:w="2448"/>
+          </w:tcPr>
+          <w:p>
+            <w:pPr>
+              <w:spacing w:before="20" w:after="20"/>
+            </w:pPr>
+            <w:r>
+              <w:rPr>
+                <w:rFonts w:ascii="Calibri" w:hAnsi="Calibri"/>
+                <w:b w:val="0"/>
+                <w:color w:val="000000"/>
+                <w:sz w:val="19"/>
+              </w:rPr>
+              <w:t>AI, Automation &amp; Security Engineering</w:t>
+            </w:r>
+          </w:p>
+        </w:tc>
+      </w:tr>
+    </w:tbl>
+    <w:p>
+      <w:pPr>
+        <w:spacing w:before="60" w:after="60"/>
+        <w:pBdr>
+          <w:bottom w:val="single" w:sz="4" w:space="1" w:color="505050"/>
+        </w:pBdr>
+      </w:pPr>
+    </w:p>
+    <w:p>
+      <w:pPr>
+        <w:spacing w:before="140" w:after="40" w:line="260" w:lineRule="exact"/>
+        <w:jc w:val="left"/>
+      </w:pPr>
+      <w:r>
+        <w:rPr>
+          <w:rFonts w:ascii="Calibri" w:hAnsi="Calibri"/>
+          <w:b/>
+          <w:i w:val="0"/>
+          <w:color w:val="0F2850"/>
+          <w:sz w:val="22"/>
+        </w:rPr>
+        <w:t>1.  Executive Summary</w:t>
+      </w:r>
+    </w:p>
+    <w:p>
+      <w:pPr>
+        <w:spacing w:before="0" w:after="80" w:line="260" w:lineRule="exact"/>
+        <w:jc w:val="left"/>
+      </w:pPr>
+      <w:r>
+        <w:rPr>
+          <w:rFonts w:ascii="Calibri" w:hAnsi="Calibri"/>
+          <w:b w:val="0"/>
+          <w:i w:val="0"/>
+          <w:color w:val="000000"/>
+          <w:sz w:val="20"/>
+        </w:rPr>
+        <w:t>Security automation matures through three tiers: Quick Scripts for immediate personal use, Production Automation as shared SOC utilities, and Security Engineering Pipelines as enterprise fault-tolerant infrastructure. This memo compares all three across five engineering dimensions — code structure, error handling, observability, testing, and documentation — with concrete SecOps scenarios and clear escalation criteria. CipherFlow was built at the Production Automation tier with deliberate design choices that support future graduation to pipeline scale.</w:t>
+      </w:r>
+    </w:p>
+    <w:p>
+      <w:pPr>
+        <w:spacing w:before="140" w:after="40" w:line="260" w:lineRule="exact"/>
+        <w:jc w:val="left"/>
+      </w:pPr>
+      <w:r>
+        <w:rPr>
+          <w:rFonts w:ascii="Calibri" w:hAnsi="Calibri"/>
+          <w:b/>
+          <w:i w:val="0"/>
+          <w:color w:val="0F2850"/>
+          <w:sz w:val="22"/>
+        </w:rPr>
+        <w:t>2.  Automation Maturity: Three-Tier Breakdown</w:t>
+      </w:r>
+    </w:p>
+    <w:p>
+      <w:pPr>
+        <w:spacing w:before="100" w:after="20" w:line="240" w:lineRule="exact"/>
+        <w:jc w:val="left"/>
+      </w:pPr>
+      <w:r>
+        <w:rPr>
+          <w:rFonts w:ascii="Calibri" w:hAnsi="Calibri"/>
+          <w:b/>
+          <w:i w:val="0"/>
+          <w:color w:val="000000"/>
+          <w:sz w:val="20"/>
+        </w:rPr>
+        <w:t>2.1  Quick Scripts — Individual, One-Off Tools</w:t>
+      </w:r>
+    </w:p>
+    <w:p>
+      <w:pPr>
+        <w:spacing w:before="0" w:after="40" w:line="260" w:lineRule="exact"/>
+        <w:ind w:left="288"/>
+        <w:jc w:val="left"/>
+      </w:pPr>
+      <w:r>
+        <w:rPr>
+          <w:rFonts w:ascii="Calibri" w:hAnsi="Calibri"/>
+          <w:b w:val="0"/>
+          <w:i w:val="0"/>
+          <w:color w:val="000000"/>
+          <w:sz w:val="20"/>
+        </w:rPr>
+        <w:t xml:space="preserve">• </w:t>
+      </w:r>
+      <w:r>
+        <w:rPr>
+          <w:rFonts w:ascii="Calibri" w:hAnsi="Calibri"/>
+          <w:b/>
+          <w:i w:val="0"/>
+          <w:color w:val="000000"/>
+          <w:sz w:val="20"/>
+        </w:rPr>
+        <w:t xml:space="preserve">Code Structure: </w:t>
+      </w:r>
+      <w:r>
+        <w:rPr>
+          <w:rFonts w:ascii="Calibri" w:hAnsi="Calibri"/>
+          <w:b w:val="0"/>
+          <w:i w:val="0"/>
+          <w:color w:val="000000"/>
+          <w:sz w:val="20"/>
+        </w:rPr>
+        <w:t>Single-file, procedural. Hardcoded paths and values. No modularity or reuse.</w:t>
+      </w:r>
+    </w:p>
+    <w:p>
+      <w:pPr>
+        <w:spacing w:before="0" w:after="40" w:line="260" w:lineRule="exact"/>
+        <w:ind w:left="288"/>
+        <w:jc w:val="left"/>
+      </w:pPr>
+      <w:r>
+        <w:rPr>
+          <w:rFonts w:ascii="Calibri" w:hAnsi="Calibri"/>
+          <w:b w:val="0"/>
+          <w:i w:val="0"/>
+          <w:color w:val="000000"/>
+          <w:sz w:val="20"/>
+        </w:rPr>
+        <w:t xml:space="preserve">• </w:t>
+      </w:r>
+      <w:r>
+        <w:rPr>
+          <w:rFonts w:ascii="Calibri" w:hAnsi="Calibri"/>
+          <w:b/>
+          <w:i w:val="0"/>
+          <w:color w:val="000000"/>
+          <w:sz w:val="20"/>
+        </w:rPr>
+        <w:t xml:space="preserve">Error Handling: </w:t>
+      </w:r>
+      <w:r>
+        <w:rPr>
+          <w:rFonts w:ascii="Calibri" w:hAnsi="Calibri"/>
+          <w:b w:val="0"/>
+          <w:i w:val="0"/>
+          <w:color w:val="000000"/>
+          <w:sz w:val="20"/>
+        </w:rPr>
+        <w:t>Crash on error. Bare try/except or none; entire run fails on any unexpected input.</w:t>
+      </w:r>
+    </w:p>
+    <w:p>
+      <w:pPr>
+        <w:spacing w:before="0" w:after="40" w:line="260" w:lineRule="exact"/>
+        <w:ind w:left="288"/>
+        <w:jc w:val="left"/>
+      </w:pPr>
+      <w:r>
+        <w:rPr>
+          <w:rFonts w:ascii="Calibri" w:hAnsi="Calibri"/>
+          <w:b w:val="0"/>
+          <w:i w:val="0"/>
+          <w:color w:val="000000"/>
+          <w:sz w:val="20"/>
+        </w:rPr>
+        <w:t xml:space="preserve">• </w:t>
+      </w:r>
+      <w:r>
+        <w:rPr>
+          <w:rFonts w:ascii="Calibri" w:hAnsi="Calibri"/>
+          <w:b/>
+          <w:i w:val="0"/>
+          <w:color w:val="000000"/>
+          <w:sz w:val="20"/>
+        </w:rPr>
+        <w:t xml:space="preserve">Observability: </w:t>
+      </w:r>
+      <w:r>
+        <w:rPr>
+          <w:rFonts w:ascii="Calibri" w:hAnsi="Calibri"/>
+          <w:b w:val="0"/>
+          <w:i w:val="0"/>
+          <w:color w:val="000000"/>
+          <w:sz w:val="20"/>
+        </w:rPr>
+        <w:t>print() only. No log files, no audit trail, no structured output.</w:t>
+      </w:r>
+    </w:p>
+    <w:p>
+      <w:pPr>
+        <w:spacing w:before="0" w:after="40" w:line="260" w:lineRule="exact"/>
+        <w:ind w:left="288"/>
+        <w:jc w:val="left"/>
+      </w:pPr>
+      <w:r>
+        <w:rPr>
+          <w:rFonts w:ascii="Calibri" w:hAnsi="Calibri"/>
+          <w:b w:val="0"/>
+          <w:i w:val="0"/>
+          <w:color w:val="000000"/>
+          <w:sz w:val="20"/>
+        </w:rPr>
+        <w:t xml:space="preserve">• </w:t>
+      </w:r>
+      <w:r>
+        <w:rPr>
+          <w:rFonts w:ascii="Calibri" w:hAnsi="Calibri"/>
+          <w:b/>
+          <w:i w:val="0"/>
+          <w:color w:val="000000"/>
+          <w:sz w:val="20"/>
+        </w:rPr>
+        <w:t xml:space="preserve">Testing: </w:t>
+      </w:r>
+      <w:r>
+        <w:rPr>
+          <w:rFonts w:ascii="Calibri" w:hAnsi="Calibri"/>
+          <w:b w:val="0"/>
+          <w:i w:val="0"/>
+          <w:color w:val="000000"/>
+          <w:sz w:val="20"/>
+        </w:rPr>
+        <w:t>Manual, ad-hoc. Run once, inspect visually. Zero automated coverage.</w:t>
+      </w:r>
+    </w:p>
+    <w:p>
+      <w:pPr>
+        <w:spacing w:before="0" w:after="40" w:line="260" w:lineRule="exact"/>
+        <w:ind w:left="288"/>
+        <w:jc w:val="left"/>
+      </w:pPr>
+      <w:r>
+        <w:rPr>
+          <w:rFonts w:ascii="Calibri" w:hAnsi="Calibri"/>
+          <w:b w:val="0"/>
+          <w:i w:val="0"/>
+          <w:color w:val="000000"/>
+          <w:sz w:val="20"/>
+        </w:rPr>
+        <w:t xml:space="preserve">• </w:t>
+      </w:r>
+      <w:r>
+        <w:rPr>
+          <w:rFonts w:ascii="Calibri" w:hAnsi="Calibri"/>
+          <w:b/>
+          <w:i w:val="0"/>
+          <w:color w:val="000000"/>
+          <w:sz w:val="20"/>
+        </w:rPr>
+        <w:t xml:space="preserve">Documentation: </w:t>
+      </w:r>
+      <w:r>
+        <w:rPr>
+          <w:rFonts w:ascii="Calibri" w:hAnsi="Calibri"/>
+          <w:b w:val="0"/>
+          <w:i w:val="0"/>
+          <w:color w:val="000000"/>
+          <w:sz w:val="20"/>
+        </w:rPr>
+        <w:t>Sparse inline notes. Typically undocumented and discarded after one use.</w:t>
+      </w:r>
+    </w:p>
+    <w:p>
+      <w:pPr>
+        <w:spacing w:before="20" w:after="100" w:line="240" w:lineRule="exact"/>
+        <w:ind w:left="288"/>
+        <w:jc w:val="left"/>
+      </w:pPr>
+      <w:r>
+        <w:rPr>
+          <w:rFonts w:ascii="Calibri" w:hAnsi="Calibri"/>
+          <w:b/>
+          <w:i/>
+          <w:color w:val="6E6E6E"/>
+          <w:sz w:val="19"/>
+        </w:rPr>
+        <w:t xml:space="preserve">Example: </w:t>
+      </w:r>
+      <w:r>
+        <w:rPr>
+          <w:rFonts w:ascii="Calibri" w:hAnsi="Calibri"/>
+          <w:b w:val="0"/>
+          <w:i/>
+          <w:color w:val="6E6E6E"/>
+          <w:sz w:val="19"/>
+        </w:rPr>
+        <w:t>Analyst writes 15 lines to extract BLOCKED IPs from a firewall CSV during an incident. Runs once, never reused.</w:t>
+      </w:r>
+    </w:p>
+    <w:p>
+      <w:pPr>
+        <w:spacing w:before="100" w:after="20" w:line="240" w:lineRule="exact"/>
+        <w:jc w:val="left"/>
+      </w:pPr>
+      <w:r>
+        <w:rPr>
+          <w:rFonts w:ascii="Calibri" w:hAnsi="Calibri"/>
+          <w:b/>
+          <w:i w:val="0"/>
+          <w:color w:val="000000"/>
+          <w:sz w:val="20"/>
+        </w:rPr>
+        <w:t>2.2  Production Automation — Shared Team Utilities</w:t>
+      </w:r>
+    </w:p>
+    <w:p>
+      <w:pPr>
+        <w:spacing w:before="0" w:after="40" w:line="260" w:lineRule="exact"/>
+        <w:ind w:left="288"/>
+        <w:jc w:val="left"/>
+      </w:pPr>
+      <w:r>
+        <w:rPr>
+          <w:rFonts w:ascii="Calibri" w:hAnsi="Calibri"/>
+          <w:b w:val="0"/>
+          <w:i w:val="0"/>
+          <w:color w:val="000000"/>
+          <w:sz w:val="20"/>
+        </w:rPr>
+        <w:t xml:space="preserve">• </w:t>
+      </w:r>
+      <w:r>
+        <w:rPr>
+          <w:rFonts w:ascii="Calibri" w:hAnsi="Calibri"/>
+          <w:b/>
+          <w:i w:val="0"/>
+          <w:color w:val="000000"/>
+          <w:sz w:val="20"/>
+        </w:rPr>
+        <w:t xml:space="preserve">Code Structure: </w:t>
+      </w:r>
+      <w:r>
+        <w:rPr>
+          <w:rFonts w:ascii="Calibri" w:hAnsi="Calibri"/>
+          <w:b w:val="0"/>
+          <w:i w:val="0"/>
+          <w:color w:val="000000"/>
+          <w:sz w:val="20"/>
+        </w:rPr>
+        <w:t>Modular multi-file package. CLI via argparse. Config via .env/YAML. Reusable functions.</w:t>
+      </w:r>
+    </w:p>
+    <w:p>
+      <w:pPr>
+        <w:spacing w:before="0" w:after="40" w:line="260" w:lineRule="exact"/>
+        <w:ind w:left="288"/>
+        <w:jc w:val="left"/>
+      </w:pPr>
+      <w:r>
+        <w:rPr>
+          <w:rFonts w:ascii="Calibri" w:hAnsi="Calibri"/>
+          <w:b w:val="0"/>
+          <w:i w:val="0"/>
+          <w:color w:val="000000"/>
+          <w:sz w:val="20"/>
+        </w:rPr>
+        <w:t xml:space="preserve">• </w:t>
+      </w:r>
+      <w:r>
+        <w:rPr>
+          <w:rFonts w:ascii="Calibri" w:hAnsi="Calibri"/>
+          <w:b/>
+          <w:i w:val="0"/>
+          <w:color w:val="000000"/>
+          <w:sz w:val="20"/>
+        </w:rPr>
+        <w:t xml:space="preserve">Error Handling: </w:t>
+      </w:r>
+      <w:r>
+        <w:rPr>
+          <w:rFonts w:ascii="Calibri" w:hAnsi="Calibri"/>
+          <w:b w:val="0"/>
+          <w:i w:val="0"/>
+          <w:color w:val="000000"/>
+          <w:sz w:val="20"/>
+        </w:rPr>
+        <w:t>Defensive and graceful — malformed lines skipped with warnings, execution continues.</w:t>
+      </w:r>
+    </w:p>
+    <w:p>
+      <w:pPr>
+        <w:spacing w:before="0" w:after="40" w:line="260" w:lineRule="exact"/>
+        <w:ind w:left="288"/>
+        <w:jc w:val="left"/>
+      </w:pPr>
+      <w:r>
+        <w:rPr>
+          <w:rFonts w:ascii="Calibri" w:hAnsi="Calibri"/>
+          <w:b w:val="0"/>
+          <w:i w:val="0"/>
+          <w:color w:val="000000"/>
+          <w:sz w:val="20"/>
+        </w:rPr>
+        <w:t xml:space="preserve">• </w:t>
+      </w:r>
+      <w:r>
+        <w:rPr>
+          <w:rFonts w:ascii="Calibri" w:hAnsi="Calibri"/>
+          <w:b/>
+          <w:i w:val="0"/>
+          <w:color w:val="000000"/>
+          <w:sz w:val="20"/>
+        </w:rPr>
+        <w:t xml:space="preserve">Observability: </w:t>
+      </w:r>
+      <w:r>
+        <w:rPr>
+          <w:rFonts w:ascii="Calibri" w:hAnsi="Calibri"/>
+          <w:b w:val="0"/>
+          <w:i w:val="0"/>
+          <w:color w:val="000000"/>
+          <w:sz w:val="20"/>
+        </w:rPr>
+        <w:t>Python logging module: timestamped INFO/WARNING/ERROR levels, rotating log files.</w:t>
+      </w:r>
+    </w:p>
+    <w:p>
+      <w:pPr>
+        <w:spacing w:before="0" w:after="40" w:line="260" w:lineRule="exact"/>
+        <w:ind w:left="288"/>
+        <w:jc w:val="left"/>
+      </w:pPr>
+      <w:r>
+        <w:rPr>
+          <w:rFonts w:ascii="Calibri" w:hAnsi="Calibri"/>
+          <w:b w:val="0"/>
+          <w:i w:val="0"/>
+          <w:color w:val="000000"/>
+          <w:sz w:val="20"/>
+        </w:rPr>
+        <w:t xml:space="preserve">• </w:t>
+      </w:r>
+      <w:r>
+        <w:rPr>
+          <w:rFonts w:ascii="Calibri" w:hAnsi="Calibri"/>
+          <w:b/>
+          <w:i w:val="0"/>
+          <w:color w:val="000000"/>
+          <w:sz w:val="20"/>
+        </w:rPr>
+        <w:t xml:space="preserve">Testing: </w:t>
+      </w:r>
+      <w:r>
+        <w:rPr>
+          <w:rFonts w:ascii="Calibri" w:hAnsi="Calibri"/>
+          <w:b w:val="0"/>
+          <w:i w:val="0"/>
+          <w:color w:val="000000"/>
+          <w:sz w:val="20"/>
+        </w:rPr>
+        <w:t>Automated pytest suites covering all formats, checks, and edge cases. Runs in CI.</w:t>
+      </w:r>
+    </w:p>
+    <w:p>
+      <w:pPr>
+        <w:spacing w:before="0" w:after="40" w:line="260" w:lineRule="exact"/>
+        <w:ind w:left="288"/>
+        <w:jc w:val="left"/>
+      </w:pPr>
+      <w:r>
+        <w:rPr>
+          <w:rFonts w:ascii="Calibri" w:hAnsi="Calibri"/>
+          <w:b w:val="0"/>
+          <w:i w:val="0"/>
+          <w:color w:val="000000"/>
+          <w:sz w:val="20"/>
+        </w:rPr>
+        <w:t xml:space="preserve">• </w:t>
+      </w:r>
+      <w:r>
+        <w:rPr>
+          <w:rFonts w:ascii="Calibri" w:hAnsi="Calibri"/>
+          <w:b/>
+          <w:i w:val="0"/>
+          <w:color w:val="000000"/>
+          <w:sz w:val="20"/>
+        </w:rPr>
+        <w:t xml:space="preserve">Documentation: </w:t>
+      </w:r>
+      <w:r>
+        <w:rPr>
+          <w:rFonts w:ascii="Calibri" w:hAnsi="Calibri"/>
+          <w:b w:val="0"/>
+          <w:i w:val="0"/>
+          <w:color w:val="000000"/>
+          <w:sz w:val="20"/>
+        </w:rPr>
+        <w:t>README.md with setup, CLI usage, schema definitions, and usage examples.</w:t>
+      </w:r>
+    </w:p>
+    <w:p>
+      <w:pPr>
+        <w:spacing w:before="20" w:after="100" w:line="240" w:lineRule="exact"/>
+        <w:ind w:left="288"/>
+        <w:jc w:val="left"/>
+      </w:pPr>
+      <w:r>
+        <w:rPr>
+          <w:rFonts w:ascii="Calibri" w:hAnsi="Calibri"/>
+          <w:b/>
+          <w:i/>
+          <w:color w:val="6E6E6E"/>
+          <w:sz w:val="19"/>
+        </w:rPr>
+        <w:t xml:space="preserve">Example: </w:t>
+      </w:r>
+      <w:r>
+        <w:rPr>
+          <w:rFonts w:ascii="Calibri" w:hAnsi="Calibri"/>
+          <w:b w:val="0"/>
+          <w:i/>
+          <w:color w:val="6E6E6E"/>
+          <w:sz w:val="19"/>
+        </w:rPr>
+        <w:t>CipherFlow — log_parser.py + quality_validator.py + pytest suite, processing daily VPN logs for brute-force detection.</w:t>
+      </w:r>
+    </w:p>
+    <w:p>
+      <w:pPr>
+        <w:spacing w:before="100" w:after="20" w:line="240" w:lineRule="exact"/>
+        <w:jc w:val="left"/>
+      </w:pPr>
+      <w:r>
+        <w:rPr>
+          <w:rFonts w:ascii="Calibri" w:hAnsi="Calibri"/>
+          <w:b/>
+          <w:i w:val="0"/>
+          <w:color w:val="000000"/>
+          <w:sz w:val="20"/>
+        </w:rPr>
+        <w:t>2.3  Security Engineering Pipelines — Enterprise Infrastructure</w:t>
+      </w:r>
+    </w:p>
+    <w:p>
+      <w:pPr>
+        <w:spacing w:before="0" w:after="40" w:line="260" w:lineRule="exact"/>
+        <w:ind w:left="288"/>
+        <w:jc w:val="left"/>
+      </w:pPr>
+      <w:r>
+        <w:rPr>
+          <w:rFonts w:ascii="Calibri" w:hAnsi="Calibri"/>
+          <w:b w:val="0"/>
+          <w:i w:val="0"/>
+          <w:color w:val="000000"/>
+          <w:sz w:val="20"/>
+        </w:rPr>
+        <w:t xml:space="preserve">• </w:t>
+      </w:r>
+      <w:r>
+        <w:rPr>
+          <w:rFonts w:ascii="Calibri" w:hAnsi="Calibri"/>
+          <w:b/>
+          <w:i w:val="0"/>
+          <w:color w:val="000000"/>
+          <w:sz w:val="20"/>
+        </w:rPr>
+        <w:t xml:space="preserve">Code Structure: </w:t>
+      </w:r>
+      <w:r>
+        <w:rPr>
+          <w:rFonts w:ascii="Calibri" w:hAnsi="Calibri"/>
+          <w:b w:val="0"/>
+          <w:i w:val="0"/>
+          <w:color w:val="000000"/>
+          <w:sz w:val="20"/>
+        </w:rPr>
+        <w:t>Microservices or event-driven stream processing (Kafka, Flink). Strict OOP, typed contracts.</w:t>
+      </w:r>
+    </w:p>
+    <w:p>
+      <w:pPr>
+        <w:spacing w:before="0" w:after="40" w:line="260" w:lineRule="exact"/>
+        <w:ind w:left="288"/>
+        <w:jc w:val="left"/>
+      </w:pPr>
+      <w:r>
+        <w:rPr>
+          <w:rFonts w:ascii="Calibri" w:hAnsi="Calibri"/>
+          <w:b w:val="0"/>
+          <w:i w:val="0"/>
+          <w:color w:val="000000"/>
+          <w:sz w:val="20"/>
+        </w:rPr>
+        <w:t xml:space="preserve">• </w:t>
+      </w:r>
+      <w:r>
+        <w:rPr>
+          <w:rFonts w:ascii="Calibri" w:hAnsi="Calibri"/>
+          <w:b/>
+          <w:i w:val="0"/>
+          <w:color w:val="000000"/>
+          <w:sz w:val="20"/>
+        </w:rPr>
+        <w:t xml:space="preserve">Error Handling: </w:t>
+      </w:r>
+      <w:r>
+        <w:rPr>
+          <w:rFonts w:ascii="Calibri" w:hAnsi="Calibri"/>
+          <w:b w:val="0"/>
+          <w:i w:val="0"/>
+          <w:color w:val="000000"/>
+          <w:sz w:val="20"/>
+        </w:rPr>
+        <w:t>Fault-tolerant: Dead-Letter Queues, retries with exponential backoff, circuit breakers.</w:t>
+      </w:r>
+    </w:p>
+    <w:p>
+      <w:pPr>
+        <w:spacing w:before="0" w:after="40" w:line="260" w:lineRule="exact"/>
+        <w:ind w:left="288"/>
+        <w:jc w:val="left"/>
+      </w:pPr>
+      <w:r>
+        <w:rPr>
+          <w:rFonts w:ascii="Calibri" w:hAnsi="Calibri"/>
+          <w:b w:val="0"/>
+          <w:i w:val="0"/>
+          <w:color w:val="000000"/>
+          <w:sz w:val="20"/>
+        </w:rPr>
+        <w:t xml:space="preserve">• </w:t>
+      </w:r>
+      <w:r>
+        <w:rPr>
+          <w:rFonts w:ascii="Calibri" w:hAnsi="Calibri"/>
+          <w:b/>
+          <w:i w:val="0"/>
+          <w:color w:val="000000"/>
+          <w:sz w:val="20"/>
+        </w:rPr>
+        <w:t xml:space="preserve">Observability: </w:t>
+      </w:r>
+      <w:r>
+        <w:rPr>
+          <w:rFonts w:ascii="Calibri" w:hAnsi="Calibri"/>
+          <w:b w:val="0"/>
+          <w:i w:val="0"/>
+          <w:color w:val="000000"/>
+          <w:sz w:val="20"/>
+        </w:rPr>
+        <w:t>Distributed tracing (OpenTelemetry), Prometheus/Grafana, SIEM. Real-time SLA alerting.</w:t>
+      </w:r>
+    </w:p>
+    <w:p>
+      <w:pPr>
+        <w:spacing w:before="0" w:after="40" w:line="260" w:lineRule="exact"/>
+        <w:ind w:left="288"/>
+        <w:jc w:val="left"/>
+      </w:pPr>
+      <w:r>
+        <w:rPr>
+          <w:rFonts w:ascii="Calibri" w:hAnsi="Calibri"/>
+          <w:b w:val="0"/>
+          <w:i w:val="0"/>
+          <w:color w:val="000000"/>
+          <w:sz w:val="20"/>
+        </w:rPr>
+        <w:t xml:space="preserve">• </w:t>
+      </w:r>
+      <w:r>
+        <w:rPr>
+          <w:rFonts w:ascii="Calibri" w:hAnsi="Calibri"/>
+          <w:b/>
+          <w:i w:val="0"/>
+          <w:color w:val="000000"/>
+          <w:sz w:val="20"/>
+        </w:rPr>
+        <w:t xml:space="preserve">Testing: </w:t>
+      </w:r>
+      <w:r>
+        <w:rPr>
+          <w:rFonts w:ascii="Calibri" w:hAnsi="Calibri"/>
+          <w:b w:val="0"/>
+          <w:i w:val="0"/>
+          <w:color w:val="000000"/>
+          <w:sz w:val="20"/>
+        </w:rPr>
+        <w:t>Full CI/CD: unit, integration, load/stress (50k+ eps), chaos engineering.</w:t>
+      </w:r>
+    </w:p>
+    <w:p>
+      <w:pPr>
+        <w:spacing w:before="0" w:after="40" w:line="260" w:lineRule="exact"/>
+        <w:ind w:left="288"/>
+        <w:jc w:val="left"/>
+      </w:pPr>
+      <w:r>
+        <w:rPr>
+          <w:rFonts w:ascii="Calibri" w:hAnsi="Calibri"/>
+          <w:b w:val="0"/>
+          <w:i w:val="0"/>
+          <w:color w:val="000000"/>
+          <w:sz w:val="20"/>
+        </w:rPr>
+        <w:t xml:space="preserve">• </w:t>
+      </w:r>
+      <w:r>
+        <w:rPr>
+          <w:rFonts w:ascii="Calibri" w:hAnsi="Calibri"/>
+          <w:b/>
+          <w:i w:val="0"/>
+          <w:color w:val="000000"/>
+          <w:sz w:val="20"/>
+        </w:rPr>
+        <w:t xml:space="preserve">Documentation: </w:t>
+      </w:r>
+      <w:r>
+        <w:rPr>
+          <w:rFonts w:ascii="Calibri" w:hAnsi="Calibri"/>
+          <w:b w:val="0"/>
+          <w:i w:val="0"/>
+          <w:color w:val="000000"/>
+          <w:sz w:val="20"/>
+        </w:rPr>
+        <w:t>ADRs, OpenAPI specs, disaster recovery runbooks, SLO/SLA definitions.</w:t>
+      </w:r>
+    </w:p>
+    <w:p>
+      <w:pPr>
+        <w:spacing w:before="20" w:after="80" w:line="240" w:lineRule="exact"/>
+        <w:ind w:left="288"/>
+        <w:jc w:val="left"/>
+      </w:pPr>
+      <w:r>
+        <w:rPr>
+          <w:rFonts w:ascii="Calibri" w:hAnsi="Calibri"/>
+          <w:b/>
+          <w:i/>
+          <w:color w:val="6E6E6E"/>
+          <w:sz w:val="19"/>
+        </w:rPr>
+        <w:t xml:space="preserve">Example: </w:t>
+      </w:r>
+      <w:r>
+        <w:rPr>
+          <w:rFonts w:ascii="Calibri" w:hAnsi="Calibri"/>
+          <w:b w:val="0"/>
+          <w:i/>
+          <w:color w:val="6E6E6E"/>
+          <w:sz w:val="19"/>
+        </w:rPr>
+        <w:t>Enterprise pipeline ingesting 500k events/sec from CloudTrail, CrowdStrike, and Palo Alto into an OCSF SIEM.</w:t>
       </w:r>
     </w:p>
     <w:p>
       <w:r>
-        <w:rPr>
-          <w:b w:val="0"/>
-        </w:rPr>
-      </w:r>
-      <w:r>
-        <w:rPr>
-          <w:b/>
-        </w:rPr>
-        <w:t>Project:</w:t>
-      </w:r>
-      <w:r>
-        <w:rPr>
-          <w:b w:val="0"/>
-        </w:rPr>
-        <w:t xml:space="preserve"> CipherFlow Security Data Engineering Pipeline</w:t>
-      </w:r>
-    </w:p>
-    <w:p>
-      <w:r>
-        <w:rPr>
-          <w:b w:val="0"/>
-        </w:rPr>
-      </w:r>
-      <w:r>
-        <w:rPr>
-          <w:b/>
-        </w:rPr>
-        <w:t>Author:</w:t>
-      </w:r>
-      <w:r>
-        <w:rPr>
-          <w:b w:val="0"/>
-        </w:rPr>
-        <w:t xml:space="preserve"> CipherFlow Lead Engineer</w:t>
-      </w:r>
-    </w:p>
-    <w:p>
-      <w:r>
-        <w:rPr>
-          <w:b w:val="0"/>
-        </w:rPr>
-      </w:r>
-      <w:r>
-        <w:rPr>
-          <w:b/>
-        </w:rPr>
-        <w:t>Date:</w:t>
-      </w:r>
-      <w:r>
-        <w:rPr>
-          <w:b w:val="0"/>
-        </w:rPr>
-        <w:t xml:space="preserve"> July 26, 2026</w:t>
-      </w:r>
-    </w:p>
-    <w:p>
-      <w:r>
-        <w:rPr>
-          <w:b w:val="0"/>
-        </w:rPr>
-      </w:r>
-      <w:r>
-        <w:rPr>
-          <w:b/>
-        </w:rPr>
-        <w:t>Subject:</w:t>
-      </w:r>
-      <w:r>
-        <w:rPr>
-          <w:b w:val="0"/>
-        </w:rPr>
-        <w:t xml:space="preserve"> Comparative Analysis of Quick Scripts, Production Automation, and Security Engineering Pipelines</w:t>
-      </w:r>
-    </w:p>
-    <w:p>
-      <w:r>
-        <w:t>---</w:t>
+        <w:br w:type="page"/>
       </w:r>
     </w:p>
     <w:p>
       <w:pPr>
-        <w:pStyle w:val="Heading2"/>
+        <w:spacing w:before="140" w:after="40" w:line="260" w:lineRule="exact"/>
+        <w:jc w:val="left"/>
       </w:pPr>
       <w:r>
-        <w:t>Executive Summary</w:t>
+        <w:rPr>
+          <w:rFonts w:ascii="Calibri" w:hAnsi="Calibri"/>
+          <w:b/>
+          <w:i w:val="0"/>
+          <w:color w:val="0F2850"/>
+          <w:sz w:val="22"/>
+        </w:rPr>
+        <w:t>3.  Comparative Summary</w:t>
       </w:r>
     </w:p>
+    <w:tbl>
+      <w:tblPr>
+        <w:tblStyle w:val="TableGrid"/>
+        <w:tblW w:type="auto" w:w="0"/>
+        <w:jc w:val="center"/>
+        <w:tblLook w:firstColumn="1" w:firstRow="1" w:lastColumn="0" w:lastRow="0" w:noHBand="0" w:noVBand="1" w:val="04A0"/>
+      </w:tblPr>
+      <w:tblGrid>
+        <w:gridCol w:w="2448"/>
+        <w:gridCol w:w="2448"/>
+        <w:gridCol w:w="2448"/>
+        <w:gridCol w:w="2448"/>
+      </w:tblGrid>
+      <w:tr>
+        <w:tc>
+          <w:tcPr>
+            <w:tcW w:type="dxa" w:w="1800"/>
+            <w:shd w:val="clear" w:color="auto" w:fill="0F2850"/>
+          </w:tcPr>
+          <w:p>
+            <w:pPr>
+              <w:spacing w:before="60" w:after="60"/>
+              <w:jc w:val="center"/>
+            </w:pPr>
+            <w:r>
+              <w:rPr>
+                <w:rFonts w:ascii="Calibri" w:hAnsi="Calibri"/>
+                <w:b/>
+                <w:color w:val="FFFFFF"/>
+                <w:sz w:val="18"/>
+              </w:rPr>
+              <w:t>Dimension</w:t>
+            </w:r>
+          </w:p>
+        </w:tc>
+        <w:tc>
+          <w:tcPr>
+            <w:tcW w:type="dxa" w:w="2160"/>
+            <w:shd w:val="clear" w:color="auto" w:fill="0F2850"/>
+          </w:tcPr>
+          <w:p>
+            <w:pPr>
+              <w:spacing w:before="60" w:after="60"/>
+              <w:jc w:val="center"/>
+            </w:pPr>
+            <w:r>
+              <w:rPr>
+                <w:rFonts w:ascii="Calibri" w:hAnsi="Calibri"/>
+                <w:b/>
+                <w:color w:val="FFFFFF"/>
+                <w:sz w:val="18"/>
+              </w:rPr>
+              <w:t>Quick Scripts</w:t>
+            </w:r>
+          </w:p>
+        </w:tc>
+        <w:tc>
+          <w:tcPr>
+            <w:tcW w:type="dxa" w:w="2520"/>
+            <w:shd w:val="clear" w:color="auto" w:fill="0F2850"/>
+          </w:tcPr>
+          <w:p>
+            <w:pPr>
+              <w:spacing w:before="60" w:after="60"/>
+              <w:jc w:val="center"/>
+            </w:pPr>
+            <w:r>
+              <w:rPr>
+                <w:rFonts w:ascii="Calibri" w:hAnsi="Calibri"/>
+                <w:b/>
+                <w:color w:val="FFFFFF"/>
+                <w:sz w:val="18"/>
+              </w:rPr>
+              <w:t>Production Automation</w:t>
+            </w:r>
+          </w:p>
+        </w:tc>
+        <w:tc>
+          <w:tcPr>
+            <w:tcW w:type="dxa" w:w="2736"/>
+            <w:shd w:val="clear" w:color="auto" w:fill="0F2850"/>
+          </w:tcPr>
+          <w:p>
+            <w:pPr>
+              <w:spacing w:before="60" w:after="60"/>
+              <w:jc w:val="center"/>
+            </w:pPr>
+            <w:r>
+              <w:rPr>
+                <w:rFonts w:ascii="Calibri" w:hAnsi="Calibri"/>
+                <w:b/>
+                <w:color w:val="FFFFFF"/>
+                <w:sz w:val="18"/>
+              </w:rPr>
+              <w:t>Engineering Pipelines</w:t>
+            </w:r>
+          </w:p>
+        </w:tc>
+      </w:tr>
+      <w:tr>
+        <w:tc>
+          <w:tcPr>
+            <w:tcW w:type="dxa" w:w="1800"/>
+            <w:shd w:val="clear" w:color="auto" w:fill="EDF2FA"/>
+          </w:tcPr>
+          <w:p>
+            <w:pPr>
+              <w:spacing w:before="40" w:after="40"/>
+            </w:pPr>
+            <w:r>
+              <w:rPr>
+                <w:rFonts w:ascii="Calibri" w:hAnsi="Calibri"/>
+                <w:b/>
+                <w:color w:val="000000"/>
+                <w:sz w:val="18"/>
+              </w:rPr>
+              <w:t>Code Structure</w:t>
+            </w:r>
+          </w:p>
+        </w:tc>
+        <w:tc>
+          <w:tcPr>
+            <w:tcW w:type="dxa" w:w="2160"/>
+            <w:shd w:val="clear" w:color="auto" w:fill="EDF2FA"/>
+          </w:tcPr>
+          <w:p>
+            <w:pPr>
+              <w:spacing w:before="40" w:after="40"/>
+            </w:pPr>
+            <w:r>
+              <w:rPr>
+                <w:rFonts w:ascii="Calibri" w:hAnsi="Calibri"/>
+                <w:b w:val="0"/>
+                <w:color w:val="000000"/>
+                <w:sz w:val="18"/>
+              </w:rPr>
+              <w:t>Single-file, procedural</w:t>
+            </w:r>
+          </w:p>
+        </w:tc>
+        <w:tc>
+          <w:tcPr>
+            <w:tcW w:type="dxa" w:w="2520"/>
+            <w:shd w:val="clear" w:color="auto" w:fill="EDF2FA"/>
+          </w:tcPr>
+          <w:p>
+            <w:pPr>
+              <w:spacing w:before="40" w:after="40"/>
+            </w:pPr>
+            <w:r>
+              <w:rPr>
+                <w:rFonts w:ascii="Calibri" w:hAnsi="Calibri"/>
+                <w:b w:val="0"/>
+                <w:color w:val="000000"/>
+                <w:sz w:val="18"/>
+              </w:rPr>
+              <w:t>Modular package + CLI</w:t>
+            </w:r>
+          </w:p>
+        </w:tc>
+        <w:tc>
+          <w:tcPr>
+            <w:tcW w:type="dxa" w:w="2736"/>
+            <w:shd w:val="clear" w:color="auto" w:fill="EDF2FA"/>
+          </w:tcPr>
+          <w:p>
+            <w:pPr>
+              <w:spacing w:before="40" w:after="40"/>
+            </w:pPr>
+            <w:r>
+              <w:rPr>
+                <w:rFonts w:ascii="Calibri" w:hAnsi="Calibri"/>
+                <w:b w:val="0"/>
+                <w:color w:val="000000"/>
+                <w:sz w:val="18"/>
+              </w:rPr>
+              <w:t>Microservices / Event-driven</w:t>
+            </w:r>
+          </w:p>
+        </w:tc>
+      </w:tr>
+      <w:tr>
+        <w:tc>
+          <w:tcPr>
+            <w:tcW w:type="dxa" w:w="1800"/>
+            <w:shd w:val="clear" w:color="auto" w:fill="FFFFFF"/>
+          </w:tcPr>
+          <w:p>
+            <w:pPr>
+              <w:spacing w:before="40" w:after="40"/>
+            </w:pPr>
+            <w:r>
+              <w:rPr>
+                <w:rFonts w:ascii="Calibri" w:hAnsi="Calibri"/>
+                <w:b/>
+                <w:color w:val="000000"/>
+                <w:sz w:val="18"/>
+              </w:rPr>
+              <w:t>Error Handling</w:t>
+            </w:r>
+          </w:p>
+        </w:tc>
+        <w:tc>
+          <w:tcPr>
+            <w:tcW w:type="dxa" w:w="2160"/>
+            <w:shd w:val="clear" w:color="auto" w:fill="FFFFFF"/>
+          </w:tcPr>
+          <w:p>
+            <w:pPr>
+              <w:spacing w:before="40" w:after="40"/>
+            </w:pPr>
+            <w:r>
+              <w:rPr>
+                <w:rFonts w:ascii="Calibri" w:hAnsi="Calibri"/>
+                <w:b w:val="0"/>
+                <w:color w:val="000000"/>
+                <w:sz w:val="18"/>
+              </w:rPr>
+              <w:t>Crash on error</w:t>
+            </w:r>
+          </w:p>
+        </w:tc>
+        <w:tc>
+          <w:tcPr>
+            <w:tcW w:type="dxa" w:w="2520"/>
+            <w:shd w:val="clear" w:color="auto" w:fill="FFFFFF"/>
+          </w:tcPr>
+          <w:p>
+            <w:pPr>
+              <w:spacing w:before="40" w:after="40"/>
+            </w:pPr>
+            <w:r>
+              <w:rPr>
+                <w:rFonts w:ascii="Calibri" w:hAnsi="Calibri"/>
+                <w:b w:val="0"/>
+                <w:color w:val="000000"/>
+                <w:sz w:val="18"/>
+              </w:rPr>
+              <w:t>Skip &amp; warn defensively</w:t>
+            </w:r>
+          </w:p>
+        </w:tc>
+        <w:tc>
+          <w:tcPr>
+            <w:tcW w:type="dxa" w:w="2736"/>
+            <w:shd w:val="clear" w:color="auto" w:fill="FFFFFF"/>
+          </w:tcPr>
+          <w:p>
+            <w:pPr>
+              <w:spacing w:before="40" w:after="40"/>
+            </w:pPr>
+            <w:r>
+              <w:rPr>
+                <w:rFonts w:ascii="Calibri" w:hAnsi="Calibri"/>
+                <w:b w:val="0"/>
+                <w:color w:val="000000"/>
+                <w:sz w:val="18"/>
+              </w:rPr>
+              <w:t>DLQ, retries, circuit breakers</w:t>
+            </w:r>
+          </w:p>
+        </w:tc>
+      </w:tr>
+      <w:tr>
+        <w:tc>
+          <w:tcPr>
+            <w:tcW w:type="dxa" w:w="1800"/>
+            <w:shd w:val="clear" w:color="auto" w:fill="EDF2FA"/>
+          </w:tcPr>
+          <w:p>
+            <w:pPr>
+              <w:spacing w:before="40" w:after="40"/>
+            </w:pPr>
+            <w:r>
+              <w:rPr>
+                <w:rFonts w:ascii="Calibri" w:hAnsi="Calibri"/>
+                <w:b/>
+                <w:color w:val="000000"/>
+                <w:sz w:val="18"/>
+              </w:rPr>
+              <w:t>Observability</w:t>
+            </w:r>
+          </w:p>
+        </w:tc>
+        <w:tc>
+          <w:tcPr>
+            <w:tcW w:type="dxa" w:w="2160"/>
+            <w:shd w:val="clear" w:color="auto" w:fill="EDF2FA"/>
+          </w:tcPr>
+          <w:p>
+            <w:pPr>
+              <w:spacing w:before="40" w:after="40"/>
+            </w:pPr>
+            <w:r>
+              <w:rPr>
+                <w:rFonts w:ascii="Calibri" w:hAnsi="Calibri"/>
+                <w:b w:val="0"/>
+                <w:color w:val="000000"/>
+                <w:sz w:val="18"/>
+              </w:rPr>
+              <w:t>print() only</w:t>
+            </w:r>
+          </w:p>
+        </w:tc>
+        <w:tc>
+          <w:tcPr>
+            <w:tcW w:type="dxa" w:w="2520"/>
+            <w:shd w:val="clear" w:color="auto" w:fill="EDF2FA"/>
+          </w:tcPr>
+          <w:p>
+            <w:pPr>
+              <w:spacing w:before="40" w:after="40"/>
+            </w:pPr>
+            <w:r>
+              <w:rPr>
+                <w:rFonts w:ascii="Calibri" w:hAnsi="Calibri"/>
+                <w:b w:val="0"/>
+                <w:color w:val="000000"/>
+                <w:sz w:val="18"/>
+              </w:rPr>
+              <w:t>Structured logging (INFO/WARN/ERR)</w:t>
+            </w:r>
+          </w:p>
+        </w:tc>
+        <w:tc>
+          <w:tcPr>
+            <w:tcW w:type="dxa" w:w="2736"/>
+            <w:shd w:val="clear" w:color="auto" w:fill="EDF2FA"/>
+          </w:tcPr>
+          <w:p>
+            <w:pPr>
+              <w:spacing w:before="40" w:after="40"/>
+            </w:pPr>
+            <w:r>
+              <w:rPr>
+                <w:rFonts w:ascii="Calibri" w:hAnsi="Calibri"/>
+                <w:b w:val="0"/>
+                <w:color w:val="000000"/>
+                <w:sz w:val="18"/>
+              </w:rPr>
+              <w:t>Prometheus, OpenTelemetry, SIEM</w:t>
+            </w:r>
+          </w:p>
+        </w:tc>
+      </w:tr>
+      <w:tr>
+        <w:tc>
+          <w:tcPr>
+            <w:tcW w:type="dxa" w:w="1800"/>
+            <w:shd w:val="clear" w:color="auto" w:fill="FFFFFF"/>
+          </w:tcPr>
+          <w:p>
+            <w:pPr>
+              <w:spacing w:before="40" w:after="40"/>
+            </w:pPr>
+            <w:r>
+              <w:rPr>
+                <w:rFonts w:ascii="Calibri" w:hAnsi="Calibri"/>
+                <w:b/>
+                <w:color w:val="000000"/>
+                <w:sz w:val="18"/>
+              </w:rPr>
+              <w:t>Testing</w:t>
+            </w:r>
+          </w:p>
+        </w:tc>
+        <w:tc>
+          <w:tcPr>
+            <w:tcW w:type="dxa" w:w="2160"/>
+            <w:shd w:val="clear" w:color="auto" w:fill="FFFFFF"/>
+          </w:tcPr>
+          <w:p>
+            <w:pPr>
+              <w:spacing w:before="40" w:after="40"/>
+            </w:pPr>
+            <w:r>
+              <w:rPr>
+                <w:rFonts w:ascii="Calibri" w:hAnsi="Calibri"/>
+                <w:b w:val="0"/>
+                <w:color w:val="000000"/>
+                <w:sz w:val="18"/>
+              </w:rPr>
+              <w:t>Manual, ad-hoc</w:t>
+            </w:r>
+          </w:p>
+        </w:tc>
+        <w:tc>
+          <w:tcPr>
+            <w:tcW w:type="dxa" w:w="2520"/>
+            <w:shd w:val="clear" w:color="auto" w:fill="FFFFFF"/>
+          </w:tcPr>
+          <w:p>
+            <w:pPr>
+              <w:spacing w:before="40" w:after="40"/>
+            </w:pPr>
+            <w:r>
+              <w:rPr>
+                <w:rFonts w:ascii="Calibri" w:hAnsi="Calibri"/>
+                <w:b w:val="0"/>
+                <w:color w:val="000000"/>
+                <w:sz w:val="18"/>
+              </w:rPr>
+              <w:t>Automated pytest, CI</w:t>
+            </w:r>
+          </w:p>
+        </w:tc>
+        <w:tc>
+          <w:tcPr>
+            <w:tcW w:type="dxa" w:w="2736"/>
+            <w:shd w:val="clear" w:color="auto" w:fill="FFFFFF"/>
+          </w:tcPr>
+          <w:p>
+            <w:pPr>
+              <w:spacing w:before="40" w:after="40"/>
+            </w:pPr>
+            <w:r>
+              <w:rPr>
+                <w:rFonts w:ascii="Calibri" w:hAnsi="Calibri"/>
+                <w:b w:val="0"/>
+                <w:color w:val="000000"/>
+                <w:sz w:val="18"/>
+              </w:rPr>
+              <w:t>CI/CD + load + chaos tests</w:t>
+            </w:r>
+          </w:p>
+        </w:tc>
+      </w:tr>
+      <w:tr>
+        <w:tc>
+          <w:tcPr>
+            <w:tcW w:type="dxa" w:w="1800"/>
+            <w:shd w:val="clear" w:color="auto" w:fill="EDF2FA"/>
+          </w:tcPr>
+          <w:p>
+            <w:pPr>
+              <w:spacing w:before="40" w:after="40"/>
+            </w:pPr>
+            <w:r>
+              <w:rPr>
+                <w:rFonts w:ascii="Calibri" w:hAnsi="Calibri"/>
+                <w:b/>
+                <w:color w:val="000000"/>
+                <w:sz w:val="18"/>
+              </w:rPr>
+              <w:t>Documentation</w:t>
+            </w:r>
+          </w:p>
+        </w:tc>
+        <w:tc>
+          <w:tcPr>
+            <w:tcW w:type="dxa" w:w="2160"/>
+            <w:shd w:val="clear" w:color="auto" w:fill="EDF2FA"/>
+          </w:tcPr>
+          <w:p>
+            <w:pPr>
+              <w:spacing w:before="40" w:after="40"/>
+            </w:pPr>
+            <w:r>
+              <w:rPr>
+                <w:rFonts w:ascii="Calibri" w:hAnsi="Calibri"/>
+                <w:b w:val="0"/>
+                <w:color w:val="000000"/>
+                <w:sz w:val="18"/>
+              </w:rPr>
+              <w:t>Inline comments only</w:t>
+            </w:r>
+          </w:p>
+        </w:tc>
+        <w:tc>
+          <w:tcPr>
+            <w:tcW w:type="dxa" w:w="2520"/>
+            <w:shd w:val="clear" w:color="auto" w:fill="EDF2FA"/>
+          </w:tcPr>
+          <w:p>
+            <w:pPr>
+              <w:spacing w:before="40" w:after="40"/>
+            </w:pPr>
+            <w:r>
+              <w:rPr>
+                <w:rFonts w:ascii="Calibri" w:hAnsi="Calibri"/>
+                <w:b w:val="0"/>
+                <w:color w:val="000000"/>
+                <w:sz w:val="18"/>
+              </w:rPr>
+              <w:t>README + CLI guides</w:t>
+            </w:r>
+          </w:p>
+        </w:tc>
+        <w:tc>
+          <w:tcPr>
+            <w:tcW w:type="dxa" w:w="2736"/>
+            <w:shd w:val="clear" w:color="auto" w:fill="EDF2FA"/>
+          </w:tcPr>
+          <w:p>
+            <w:pPr>
+              <w:spacing w:before="40" w:after="40"/>
+            </w:pPr>
+            <w:r>
+              <w:rPr>
+                <w:rFonts w:ascii="Calibri" w:hAnsi="Calibri"/>
+                <w:b w:val="0"/>
+                <w:color w:val="000000"/>
+                <w:sz w:val="18"/>
+              </w:rPr>
+              <w:t>ADRs, runbooks, OpenAPI specs</w:t>
+            </w:r>
+          </w:p>
+        </w:tc>
+      </w:tr>
+      <w:tr>
+        <w:tc>
+          <w:tcPr>
+            <w:tcW w:type="dxa" w:w="1800"/>
+            <w:shd w:val="clear" w:color="auto" w:fill="FFFFFF"/>
+          </w:tcPr>
+          <w:p>
+            <w:pPr>
+              <w:spacing w:before="40" w:after="40"/>
+            </w:pPr>
+            <w:r>
+              <w:rPr>
+                <w:rFonts w:ascii="Calibri" w:hAnsi="Calibri"/>
+                <w:b/>
+                <w:color w:val="000000"/>
+                <w:sz w:val="18"/>
+              </w:rPr>
+              <w:t>Scale</w:t>
+            </w:r>
+          </w:p>
+        </w:tc>
+        <w:tc>
+          <w:tcPr>
+            <w:tcW w:type="dxa" w:w="2160"/>
+            <w:shd w:val="clear" w:color="auto" w:fill="FFFFFF"/>
+          </w:tcPr>
+          <w:p>
+            <w:pPr>
+              <w:spacing w:before="40" w:after="40"/>
+            </w:pPr>
+            <w:r>
+              <w:rPr>
+                <w:rFonts w:ascii="Calibri" w:hAnsi="Calibri"/>
+                <w:b w:val="0"/>
+                <w:color w:val="000000"/>
+                <w:sz w:val="18"/>
+              </w:rPr>
+              <w:t>&lt; 10k events</w:t>
+            </w:r>
+          </w:p>
+        </w:tc>
+        <w:tc>
+          <w:tcPr>
+            <w:tcW w:type="dxa" w:w="2520"/>
+            <w:shd w:val="clear" w:color="auto" w:fill="FFFFFF"/>
+          </w:tcPr>
+          <w:p>
+            <w:pPr>
+              <w:spacing w:before="40" w:after="40"/>
+            </w:pPr>
+            <w:r>
+              <w:rPr>
+                <w:rFonts w:ascii="Calibri" w:hAnsi="Calibri"/>
+                <w:b w:val="0"/>
+                <w:color w:val="000000"/>
+                <w:sz w:val="18"/>
+              </w:rPr>
+              <w:t>10k – 1M events</w:t>
+            </w:r>
+          </w:p>
+        </w:tc>
+        <w:tc>
+          <w:tcPr>
+            <w:tcW w:type="dxa" w:w="2736"/>
+            <w:shd w:val="clear" w:color="auto" w:fill="FFFFFF"/>
+          </w:tcPr>
+          <w:p>
+            <w:pPr>
+              <w:spacing w:before="40" w:after="40"/>
+            </w:pPr>
+            <w:r>
+              <w:rPr>
+                <w:rFonts w:ascii="Calibri" w:hAnsi="Calibri"/>
+                <w:b w:val="0"/>
+                <w:color w:val="000000"/>
+                <w:sz w:val="18"/>
+              </w:rPr>
+              <w:t>&gt; 1M events/day streaming</w:t>
+            </w:r>
+          </w:p>
+        </w:tc>
+      </w:tr>
+    </w:tbl>
     <w:p>
+      <w:pPr>
+        <w:spacing w:before="140" w:after="40" w:line="260" w:lineRule="exact"/>
+        <w:jc w:val="left"/>
+      </w:pPr>
       <w:r>
-        <w:t>As security operations scale, software automation transitions through three distinct maturity tiers:</w:t>
-      </w:r>
-    </w:p>
-    <w:p>
-      <w:r>
-        <w:t>(1) Quick Scripts for immediate single-use operational needs; (2) Production Automation as robust shared</w:t>
-      </w:r>
-    </w:p>
-    <w:p>
-      <w:r>
-        <w:t>utilities for SecOps teams; and (3) Security Engineering Pipelines as fault-tolerant, high-throughput</w:t>
-      </w:r>
-    </w:p>
-    <w:p>
-      <w:r>
-        <w:t>enterprise infrastructure. This memo compares these three categories across five dimensions: code structure,</w:t>
-      </w:r>
-    </w:p>
-    <w:p>
-      <w:r>
-        <w:t>error handling, observability, testing, and documentation, illustrated with real SecOps scenarios.</w:t>
-      </w:r>
-    </w:p>
-    <w:p>
-      <w:r>
-        <w:t>---</w:t>
+        <w:rPr>
+          <w:rFonts w:ascii="Calibri" w:hAnsi="Calibri"/>
+          <w:b/>
+          <w:i w:val="0"/>
+          <w:color w:val="0F2850"/>
+          <w:sz w:val="22"/>
+        </w:rPr>
+        <w:t>4.  When to Escalate</w:t>
       </w:r>
     </w:p>
     <w:p>
       <w:pPr>
-        <w:pStyle w:val="Heading2"/>
+        <w:spacing w:before="0" w:after="40" w:line="260" w:lineRule="exact"/>
+        <w:ind w:left="288"/>
+        <w:jc w:val="left"/>
       </w:pPr>
       <w:r>
-        <w:t>1. Quick Scripts</w:t>
+        <w:rPr>
+          <w:rFonts w:ascii="Calibri" w:hAnsi="Calibri"/>
+          <w:b w:val="0"/>
+          <w:i w:val="0"/>
+          <w:color w:val="000000"/>
+          <w:sz w:val="20"/>
+        </w:rPr>
+        <w:t xml:space="preserve">• </w:t>
       </w:r>
-    </w:p>
-    <w:p>
       <w:r>
-        <w:t>Quick scripts are localized, one-off automation tools created by a single engineer for immediate, high-urgency tasks.</w:t>
+        <w:rPr>
+          <w:rFonts w:ascii="Calibri" w:hAnsi="Calibri"/>
+          <w:b/>
+          <w:i w:val="0"/>
+          <w:color w:val="000000"/>
+          <w:sz w:val="20"/>
+        </w:rPr>
+        <w:t xml:space="preserve">Script → Production: </w:t>
+      </w:r>
+      <w:r>
+        <w:rPr>
+          <w:rFonts w:ascii="Calibri" w:hAnsi="Calibri"/>
+          <w:b w:val="0"/>
+          <w:i w:val="0"/>
+          <w:color w:val="000000"/>
+          <w:sz w:val="20"/>
+        </w:rPr>
+        <w:t>When a script is shared with any teammate, runs on a recurring schedule, or its failure directly impacts team operations. Trigger: user base &gt; 1, reuse &gt; weekly, or output consumed downstream.</w:t>
       </w:r>
     </w:p>
     <w:p>
       <w:pPr>
-        <w:pStyle w:val="ListBullet"/>
+        <w:spacing w:before="0" w:after="40" w:line="260" w:lineRule="exact"/>
+        <w:ind w:left="288"/>
+        <w:jc w:val="left"/>
       </w:pPr>
       <w:r>
         <w:rPr>
+          <w:rFonts w:ascii="Calibri" w:hAnsi="Calibri"/>
           <w:b w:val="0"/>
+          <w:i w:val="0"/>
+          <w:color w:val="000000"/>
+          <w:sz w:val="20"/>
         </w:rPr>
+        <w:t xml:space="preserve">• </w:t>
       </w:r>
       <w:r>
         <w:rPr>
+          <w:rFonts w:ascii="Calibri" w:hAnsi="Calibri"/>
           <w:b/>
+          <w:i w:val="0"/>
+          <w:color w:val="000000"/>
+          <w:sz w:val="20"/>
         </w:rPr>
-        <w:t>Code Structure:</w:t>
+        <w:t xml:space="preserve">Production → Pipeline: </w:t>
       </w:r>
       <w:r>
         <w:rPr>
+          <w:rFonts w:ascii="Calibri" w:hAnsi="Calibri"/>
           <w:b w:val="0"/>
+          <w:i w:val="0"/>
+          <w:color w:val="000000"/>
+          <w:sz w:val="20"/>
         </w:rPr>
-        <w:t xml:space="preserve"> Monolithic single-file scripts with procedural logic and hardcoded values.</w:t>
+        <w:t>When single-node throughput cannot meet volume demands, real-time latency SLAs apply, or outages risk compliance violations. Trigger: &gt; 1M events/day, latency SLA &lt; 5 s, or data loss = breach.</w:t>
       </w:r>
     </w:p>
     <w:p>
       <w:pPr>
-        <w:pStyle w:val="ListBullet"/>
+        <w:spacing w:before="140" w:after="40" w:line="260" w:lineRule="exact"/>
+        <w:jc w:val="left"/>
       </w:pPr>
       <w:r>
         <w:rPr>
-          <w:b w:val="0"/>
+          <w:rFonts w:ascii="Calibri" w:hAnsi="Calibri"/>
+          <w:b/>
+          <w:i w:val="0"/>
+          <w:color w:val="0F2850"/>
+          <w:sz w:val="22"/>
         </w:rPr>
+        <w:t>5.  What CipherFlow Delivers</w:t>
       </w:r>
-      <w:r>
-        <w:rPr>
-          <w:b/>
-        </w:rPr>
-        <w:t>Error Handling:</w:t>
-      </w:r>
-      <w:r>
-        <w:rPr>
-          <w:b w:val="0"/>
-        </w:rPr>
-        <w:t xml:space="preserve"> Minimal or absent. Generic try/except blocks, crash-on-error behaviour.</w:t>
-      </w:r>
+    </w:p>
+    <w:tbl>
+      <w:tblPr>
+        <w:tblStyle w:val="TableGrid"/>
+        <w:tblW w:type="auto" w:w="0"/>
+        <w:jc w:val="center"/>
+        <w:tblLook w:firstColumn="1" w:firstRow="1" w:lastColumn="0" w:lastRow="0" w:noHBand="0" w:noVBand="1" w:val="04A0"/>
+      </w:tblPr>
+      <w:tblGrid>
+        <w:gridCol w:w="4896"/>
+        <w:gridCol w:w="4896"/>
+      </w:tblGrid>
+      <w:tr>
+        <w:tc>
+          <w:tcPr>
+            <w:tcW w:type="dxa" w:w="2448"/>
+            <w:shd w:val="clear" w:color="auto" w:fill="0F2850"/>
+          </w:tcPr>
+          <w:p>
+            <w:pPr>
+              <w:spacing w:before="60" w:after="60"/>
+              <w:jc w:val="center"/>
+            </w:pPr>
+            <w:r>
+              <w:rPr>
+                <w:rFonts w:ascii="Calibri" w:hAnsi="Calibri"/>
+                <w:b/>
+                <w:color w:val="FFFFFF"/>
+                <w:sz w:val="18"/>
+              </w:rPr>
+              <w:t>Component</w:t>
+            </w:r>
+          </w:p>
+        </w:tc>
+        <w:tc>
+          <w:tcPr>
+            <w:tcW w:type="dxa" w:w="6768"/>
+            <w:shd w:val="clear" w:color="auto" w:fill="0F2850"/>
+          </w:tcPr>
+          <w:p>
+            <w:pPr>
+              <w:spacing w:before="60" w:after="60"/>
+              <w:jc w:val="center"/>
+            </w:pPr>
+            <w:r>
+              <w:rPr>
+                <w:rFonts w:ascii="Calibri" w:hAnsi="Calibri"/>
+                <w:b/>
+                <w:color w:val="FFFFFF"/>
+                <w:sz w:val="18"/>
+              </w:rPr>
+              <w:t>What It Does</w:t>
+            </w:r>
+          </w:p>
+        </w:tc>
+      </w:tr>
+      <w:tr>
+        <w:tc>
+          <w:tcPr>
+            <w:tcW w:type="dxa" w:w="2448"/>
+            <w:shd w:val="clear" w:color="auto" w:fill="EDF2FA"/>
+          </w:tcPr>
+          <w:p>
+            <w:pPr>
+              <w:spacing w:before="40" w:after="40" w:line="240" w:lineRule="exact"/>
+            </w:pPr>
+            <w:r>
+              <w:rPr>
+                <w:rFonts w:ascii="Calibri" w:hAnsi="Calibri"/>
+                <w:b/>
+                <w:color w:val="000000"/>
+                <w:sz w:val="18"/>
+              </w:rPr>
+              <w:t>log_parser.py</w:t>
+            </w:r>
+          </w:p>
+        </w:tc>
+        <w:tc>
+          <w:tcPr>
+            <w:tcW w:type="dxa" w:w="6768"/>
+            <w:shd w:val="clear" w:color="auto" w:fill="EDF2FA"/>
+          </w:tcPr>
+          <w:p>
+            <w:pPr>
+              <w:spacing w:before="40" w:after="40" w:line="240" w:lineRule="exact"/>
+            </w:pPr>
+            <w:r>
+              <w:rPr>
+                <w:rFonts w:ascii="Calibri" w:hAnsi="Calibri"/>
+                <w:b w:val="0"/>
+                <w:color w:val="000000"/>
+                <w:sz w:val="18"/>
+              </w:rPr>
+              <w:t>Parses Firewall CSV, Auth, and DNS logs → unified 10-field JSONL schema. UUID4 IDs, Z-format UTC timestamps, IP validation, graceful malformed-line skipping.</w:t>
+            </w:r>
+          </w:p>
+        </w:tc>
+      </w:tr>
+      <w:tr>
+        <w:tc>
+          <w:tcPr>
+            <w:tcW w:type="dxa" w:w="2448"/>
+            <w:shd w:val="clear" w:color="auto" w:fill="FFFFFF"/>
+          </w:tcPr>
+          <w:p>
+            <w:pPr>
+              <w:spacing w:before="40" w:after="40" w:line="240" w:lineRule="exact"/>
+            </w:pPr>
+            <w:r>
+              <w:rPr>
+                <w:rFonts w:ascii="Calibri" w:hAnsi="Calibri"/>
+                <w:b/>
+                <w:color w:val="000000"/>
+                <w:sz w:val="18"/>
+              </w:rPr>
+              <w:t>quality_validator.py</w:t>
+            </w:r>
+          </w:p>
+        </w:tc>
+        <w:tc>
+          <w:tcPr>
+            <w:tcW w:type="dxa" w:w="6768"/>
+            <w:shd w:val="clear" w:color="auto" w:fill="FFFFFF"/>
+          </w:tcPr>
+          <w:p>
+            <w:pPr>
+              <w:spacing w:before="40" w:after="40" w:line="240" w:lineRule="exact"/>
+            </w:pPr>
+            <w:r>
+              <w:rPr>
+                <w:rFonts w:ascii="Calibri" w:hAnsi="Calibri"/>
+                <w:b w:val="0"/>
+                <w:color w:val="000000"/>
+                <w:sz w:val="18"/>
+              </w:rPr>
+              <w:t>5 modular checks: missing fields, IP validation + private-IP flagging, timestamp anomalies, duplicate detection, suspicious pattern analysis. Outputs console / CSV / JSON reports.</w:t>
+            </w:r>
+          </w:p>
+        </w:tc>
+      </w:tr>
+      <w:tr>
+        <w:tc>
+          <w:tcPr>
+            <w:tcW w:type="dxa" w:w="2448"/>
+            <w:shd w:val="clear" w:color="auto" w:fill="EDF2FA"/>
+          </w:tcPr>
+          <w:p>
+            <w:pPr>
+              <w:spacing w:before="40" w:after="40" w:line="240" w:lineRule="exact"/>
+            </w:pPr>
+            <w:r>
+              <w:rPr>
+                <w:rFonts w:ascii="Calibri" w:hAnsi="Calibri"/>
+                <w:b/>
+                <w:color w:val="000000"/>
+                <w:sz w:val="18"/>
+              </w:rPr>
+              <w:t>FastAPI Backend + WS /ws</w:t>
+            </w:r>
+          </w:p>
+        </w:tc>
+        <w:tc>
+          <w:tcPr>
+            <w:tcW w:type="dxa" w:w="6768"/>
+            <w:shd w:val="clear" w:color="auto" w:fill="EDF2FA"/>
+          </w:tcPr>
+          <w:p>
+            <w:pPr>
+              <w:spacing w:before="40" w:after="40" w:line="240" w:lineRule="exact"/>
+            </w:pPr>
+            <w:r>
+              <w:rPr>
+                <w:rFonts w:ascii="Calibri" w:hAnsi="Calibri"/>
+                <w:b w:val="0"/>
+                <w:color w:val="000000"/>
+                <w:sz w:val="18"/>
+              </w:rPr>
+              <w:t>REST API + real WebSocket endpoint pushing live stats snapshots every 2 seconds to connected clients. Attack simulation (DDoS, Brute Force, DNS Tunneling).</w:t>
+            </w:r>
+          </w:p>
+        </w:tc>
+      </w:tr>
+      <w:tr>
+        <w:tc>
+          <w:tcPr>
+            <w:tcW w:type="dxa" w:w="2448"/>
+            <w:shd w:val="clear" w:color="auto" w:fill="FFFFFF"/>
+          </w:tcPr>
+          <w:p>
+            <w:pPr>
+              <w:spacing w:before="40" w:after="40" w:line="240" w:lineRule="exact"/>
+            </w:pPr>
+            <w:r>
+              <w:rPr>
+                <w:rFonts w:ascii="Calibri" w:hAnsi="Calibri"/>
+                <w:b/>
+                <w:color w:val="000000"/>
+                <w:sz w:val="18"/>
+              </w:rPr>
+              <w:t>React Dashboard</w:t>
+            </w:r>
+          </w:p>
+        </w:tc>
+        <w:tc>
+          <w:tcPr>
+            <w:tcW w:type="dxa" w:w="6768"/>
+            <w:shd w:val="clear" w:color="auto" w:fill="FFFFFF"/>
+          </w:tcPr>
+          <w:p>
+            <w:pPr>
+              <w:spacing w:before="40" w:after="40" w:line="240" w:lineRule="exact"/>
+            </w:pPr>
+            <w:r>
+              <w:rPr>
+                <w:rFonts w:ascii="Calibri" w:hAnsi="Calibri"/>
+                <w:b w:val="0"/>
+                <w:color w:val="000000"/>
+                <w:sz w:val="18"/>
+              </w:rPr>
+              <w:t>Midnight Crimson SOC dashboard — risk gauges, event timeline, live notifications, attack controls. Glassmorphism design, Recharts visualizations.</w:t>
+            </w:r>
+          </w:p>
+        </w:tc>
+      </w:tr>
+      <w:tr>
+        <w:tc>
+          <w:tcPr>
+            <w:tcW w:type="dxa" w:w="2448"/>
+            <w:shd w:val="clear" w:color="auto" w:fill="EDF2FA"/>
+          </w:tcPr>
+          <w:p>
+            <w:pPr>
+              <w:spacing w:before="40" w:after="40" w:line="240" w:lineRule="exact"/>
+            </w:pPr>
+            <w:r>
+              <w:rPr>
+                <w:rFonts w:ascii="Calibri" w:hAnsi="Calibri"/>
+                <w:b/>
+                <w:color w:val="000000"/>
+                <w:sz w:val="18"/>
+              </w:rPr>
+              <w:t>Scale Test (Task 4)</w:t>
+            </w:r>
+          </w:p>
+        </w:tc>
+        <w:tc>
+          <w:tcPr>
+            <w:tcW w:type="dxa" w:w="6768"/>
+            <w:shd w:val="clear" w:color="auto" w:fill="EDF2FA"/>
+          </w:tcPr>
+          <w:p>
+            <w:pPr>
+              <w:spacing w:before="40" w:after="40" w:line="240" w:lineRule="exact"/>
+            </w:pPr>
+            <w:r>
+              <w:rPr>
+                <w:rFonts w:ascii="Calibri" w:hAnsi="Calibri"/>
+                <w:b w:val="0"/>
+                <w:color w:val="000000"/>
+                <w:sz w:val="18"/>
+              </w:rPr>
+              <w:t>15,000 synthetic records processed at &gt; 40,000 rec/sec. Peak memory 18 MB (tracemalloc). Bottleneck: JSON serialization — streaming fix documented in PERFORMANCE.md.</w:t>
+            </w:r>
+          </w:p>
+        </w:tc>
+      </w:tr>
+      <w:tr>
+        <w:tc>
+          <w:tcPr>
+            <w:tcW w:type="dxa" w:w="2448"/>
+            <w:shd w:val="clear" w:color="auto" w:fill="FFFFFF"/>
+          </w:tcPr>
+          <w:p>
+            <w:pPr>
+              <w:spacing w:before="40" w:after="40" w:line="240" w:lineRule="exact"/>
+            </w:pPr>
+            <w:r>
+              <w:rPr>
+                <w:rFonts w:ascii="Calibri" w:hAnsi="Calibri"/>
+                <w:b/>
+                <w:color w:val="000000"/>
+                <w:sz w:val="18"/>
+              </w:rPr>
+              <w:t>Test Suite</w:t>
+            </w:r>
+          </w:p>
+        </w:tc>
+        <w:tc>
+          <w:tcPr>
+            <w:tcW w:type="dxa" w:w="6768"/>
+            <w:shd w:val="clear" w:color="auto" w:fill="FFFFFF"/>
+          </w:tcPr>
+          <w:p>
+            <w:pPr>
+              <w:spacing w:before="40" w:after="40" w:line="240" w:lineRule="exact"/>
+            </w:pPr>
+            <w:r>
+              <w:rPr>
+                <w:rFonts w:ascii="Calibri" w:hAnsi="Calibri"/>
+                <w:b w:val="0"/>
+                <w:color w:val="000000"/>
+                <w:sz w:val="18"/>
+              </w:rPr>
+              <w:t>17 pytest tests across parser and validator — 100 % pass rate on clean checkout. Covers all 3 formats, 5 validator checks, timestamp, IP, malformed-line, and end-to-end.</w:t>
+            </w:r>
+          </w:p>
+        </w:tc>
+      </w:tr>
+    </w:tbl>
+    <w:p>
+      <w:pPr>
+        <w:spacing w:before="60" w:after="60"/>
+        <w:pBdr>
+          <w:bottom w:val="single" w:sz="4" w:space="1" w:color="505050"/>
+        </w:pBdr>
+      </w:pPr>
     </w:p>
     <w:p>
       <w:pPr>
-        <w:pStyle w:val="ListBullet"/>
+        <w:spacing w:before="40" w:after="0" w:line="260" w:lineRule="exact"/>
+        <w:jc w:val="center"/>
       </w:pPr>
       <w:r>
         <w:rPr>
+          <w:rFonts w:ascii="Calibri" w:hAnsi="Calibri"/>
           <w:b w:val="0"/>
+          <w:i/>
+          <w:color w:val="6E6E6E"/>
+          <w:sz w:val="17"/>
         </w:rPr>
-      </w:r>
-      <w:r>
-        <w:rPr>
-          <w:b/>
-        </w:rPr>
-        <w:t>Observability:</w:t>
-      </w:r>
-      <w:r>
-        <w:rPr>
-          <w:b w:val="0"/>
-        </w:rPr>
-        <w:t xml:space="preserve"> Limited to print() statements to stdout. No logs, no audit trail.</w:t>
-      </w:r>
-    </w:p>
-    <w:p>
-      <w:pPr>
-        <w:pStyle w:val="ListBullet"/>
-      </w:pPr>
-      <w:r>
-        <w:rPr>
-          <w:b w:val="0"/>
-        </w:rPr>
-      </w:r>
-      <w:r>
-        <w:rPr>
-          <w:b/>
-        </w:rPr>
-        <w:t>Testing:</w:t>
-      </w:r>
-      <w:r>
-        <w:rPr>
-          <w:b w:val="0"/>
-        </w:rPr>
-        <w:t xml:space="preserve"> Purely manual, single ad-hoc run. No unit tests.</w:t>
-      </w:r>
-    </w:p>
-    <w:p>
-      <w:pPr>
-        <w:pStyle w:val="ListBullet"/>
-      </w:pPr>
-      <w:r>
-        <w:rPr>
-          <w:b w:val="0"/>
-        </w:rPr>
-      </w:r>
-      <w:r>
-        <w:rPr>
-          <w:b/>
-        </w:rPr>
-        <w:t>Documentation:</w:t>
-      </w:r>
-      <w:r>
-        <w:rPr>
-          <w:b w:val="0"/>
-        </w:rPr>
-        <w:t xml:space="preserve"> Minimal inline comments. Script is often discarded after use.</w:t>
-      </w:r>
-    </w:p>
-    <w:p>
-      <w:r>
-        <w:rPr>
-          <w:b w:val="0"/>
-        </w:rPr>
-      </w:r>
-      <w:r>
-        <w:rPr>
-          <w:b/>
-        </w:rPr>
-        <w:t>SecOps Example:</w:t>
-      </w:r>
-      <w:r>
-        <w:rPr>
-          <w:b w:val="0"/>
-        </w:rPr>
-        <w:t xml:space="preserve"> During a ransomware incident, an analyst writes a 15-line Python script to filter</w:t>
-      </w:r>
-    </w:p>
-    <w:p>
-      <w:r>
-        <w:t>unique BLOCKED destination IPs from a firewall CSV and print them to the terminal for WHOIS lookups.</w:t>
-      </w:r>
-    </w:p>
-    <w:p>
-      <w:r>
-        <w:t>The script runs once and is never reused.</w:t>
-      </w:r>
-    </w:p>
-    <w:p>
-      <w:r>
-        <w:t>---</w:t>
-      </w:r>
-    </w:p>
-    <w:p>
-      <w:pPr>
-        <w:pStyle w:val="Heading2"/>
-      </w:pPr>
-      <w:r>
-        <w:t>2. Production Automation</w:t>
-      </w:r>
-    </w:p>
-    <w:p>
-      <w:r>
-        <w:t>Production automation tools automate recurring SecOps workflows and are shared across the team.</w:t>
-      </w:r>
-    </w:p>
-    <w:p>
-      <w:pPr>
-        <w:pStyle w:val="ListBullet"/>
-      </w:pPr>
-      <w:r>
-        <w:rPr>
-          <w:b w:val="0"/>
-        </w:rPr>
-      </w:r>
-      <w:r>
-        <w:rPr>
-          <w:b/>
-        </w:rPr>
-        <w:t>Code Structure:</w:t>
-      </w:r>
-      <w:r>
-        <w:rPr>
-          <w:b w:val="0"/>
-        </w:rPr>
-        <w:t xml:space="preserve"> Modular, multi-file packages. CLI via argparse. Config via .env or YAML.</w:t>
-      </w:r>
-    </w:p>
-    <w:p>
-      <w:pPr>
-        <w:pStyle w:val="ListBullet"/>
-      </w:pPr>
-      <w:r>
-        <w:rPr>
-          <w:b w:val="0"/>
-        </w:rPr>
-      </w:r>
-      <w:r>
-        <w:rPr>
-          <w:b/>
-        </w:rPr>
-        <w:t>Error Handling:</w:t>
-      </w:r>
-      <w:r>
-        <w:rPr>
-          <w:b w:val="0"/>
-        </w:rPr>
-        <w:t xml:space="preserve"> Defensive and graceful. Malformed inputs are skipped with warnings; execution continues.</w:t>
-      </w:r>
-    </w:p>
-    <w:p>
-      <w:pPr>
-        <w:pStyle w:val="ListBullet"/>
-      </w:pPr>
-      <w:r>
-        <w:rPr>
-          <w:b w:val="0"/>
-        </w:rPr>
-      </w:r>
-      <w:r>
-        <w:rPr>
-          <w:b/>
-        </w:rPr>
-        <w:t>Observability:</w:t>
-      </w:r>
-      <w:r>
-        <w:rPr>
-          <w:b w:val="0"/>
-        </w:rPr>
-        <w:t xml:space="preserve"> Structured logging with Python's logging module. Timestamped INFO/WARNING/ERROR levels.</w:t>
-      </w:r>
-    </w:p>
-    <w:p>
-      <w:pPr>
-        <w:pStyle w:val="ListBullet"/>
-      </w:pPr>
-      <w:r>
-        <w:rPr>
-          <w:b w:val="0"/>
-        </w:rPr>
-      </w:r>
-      <w:r>
-        <w:rPr>
-          <w:b/>
-        </w:rPr>
-        <w:t>Testing:</w:t>
-      </w:r>
-      <w:r>
-        <w:rPr>
-          <w:b w:val="0"/>
-        </w:rPr>
-        <w:t xml:space="preserve"> Automated unit tests via pytest covering parsing, validation, and edge cases.</w:t>
-      </w:r>
-    </w:p>
-    <w:p>
-      <w:pPr>
-        <w:pStyle w:val="ListBullet"/>
-      </w:pPr>
-      <w:r>
-        <w:rPr>
-          <w:b w:val="0"/>
-        </w:rPr>
-      </w:r>
-      <w:r>
-        <w:rPr>
-          <w:b/>
-        </w:rPr>
-        <w:t>Documentation:</w:t>
-      </w:r>
-      <w:r>
-        <w:rPr>
-          <w:b w:val="0"/>
-        </w:rPr>
-        <w:t xml:space="preserve"> Comprehensive README.md with setup, CLI usage examples, and schema definitions.</w:t>
-      </w:r>
-    </w:p>
-    <w:p>
-      <w:r>
-        <w:rPr>
-          <w:b w:val="0"/>
-        </w:rPr>
-      </w:r>
-      <w:r>
-        <w:rPr>
-          <w:b/>
-        </w:rPr>
-        <w:t>SecOps Example:</w:t>
-      </w:r>
-      <w:r>
-        <w:rPr>
-          <w:b w:val="0"/>
-        </w:rPr>
-        <w:t xml:space="preserve"> A SOC team builds log_parser.py and quality_validator.py with a pytest suite and CLI</w:t>
-      </w:r>
-    </w:p>
-    <w:p>
-      <w:r>
-        <w:t>arguments to daily ingest VPN authentication logs and detect brute-force attempts. Runs on a cron job.</w:t>
-      </w:r>
-    </w:p>
-    <w:p>
-      <w:r>
-        <w:t>---</w:t>
-      </w:r>
-    </w:p>
-    <w:p>
-      <w:pPr>
-        <w:pStyle w:val="Heading2"/>
-      </w:pPr>
-      <w:r>
-        <w:t>3. Security Engineering Pipelines</w:t>
-      </w:r>
-    </w:p>
-    <w:p>
-      <w:r>
-        <w:t>Security engineering pipelines are enterprise-grade, distributed systems for continuous high-volume processing.</w:t>
-      </w:r>
-    </w:p>
-    <w:p>
-      <w:pPr>
-        <w:pStyle w:val="ListBullet"/>
-      </w:pPr>
-      <w:r>
-        <w:rPr>
-          <w:b w:val="0"/>
-        </w:rPr>
-      </w:r>
-      <w:r>
-        <w:rPr>
-          <w:b/>
-        </w:rPr>
-        <w:t>Code Structure:</w:t>
-      </w:r>
-      <w:r>
-        <w:rPr>
-          <w:b w:val="0"/>
-        </w:rPr>
-        <w:t xml:space="preserve"> Microservices or event-driven stream processing (Kafka, Flink, Kinesis).</w:t>
-      </w:r>
-    </w:p>
-    <w:p>
-      <w:r>
-        <w:t>Strict OOP/FP design patterns, type hints, Protobuf/Avro data contracts.</w:t>
-      </w:r>
-    </w:p>
-    <w:p>
-      <w:pPr>
-        <w:pStyle w:val="ListBullet"/>
-      </w:pPr>
-      <w:r>
-        <w:rPr>
-          <w:b w:val="0"/>
-        </w:rPr>
-      </w:r>
-      <w:r>
-        <w:rPr>
-          <w:b/>
-        </w:rPr>
-        <w:t>Error Handling:</w:t>
-      </w:r>
-      <w:r>
-        <w:rPr>
-          <w:b w:val="0"/>
-        </w:rPr>
-        <w:t xml:space="preserve"> Fault-tolerant. Dead-Letter Queues, retries with exponential backoff, circuit breakers.</w:t>
-      </w:r>
-    </w:p>
-    <w:p>
-      <w:pPr>
-        <w:pStyle w:val="ListBullet"/>
-      </w:pPr>
-      <w:r>
-        <w:rPr>
-          <w:b w:val="0"/>
-        </w:rPr>
-      </w:r>
-      <w:r>
-        <w:rPr>
-          <w:b/>
-        </w:rPr>
-        <w:t>Observability:</w:t>
-      </w:r>
-      <w:r>
-        <w:rPr>
-          <w:b w:val="0"/>
-        </w:rPr>
-        <w:t xml:space="preserve"> Distributed tracing (OpenTelemetry), Prometheus/Grafana dashboards, centralized</w:t>
-      </w:r>
-    </w:p>
-    <w:p>
-      <w:r>
-        <w:t>Elasticsearch/Splunk log management. Real-time throughput, latency, and error metrics.</w:t>
-      </w:r>
-    </w:p>
-    <w:p>
-      <w:pPr>
-        <w:pStyle w:val="ListBullet"/>
-      </w:pPr>
-      <w:r>
-        <w:rPr>
-          <w:b w:val="0"/>
-        </w:rPr>
-      </w:r>
-      <w:r>
-        <w:rPr>
-          <w:b/>
-        </w:rPr>
-        <w:t>Testing:</w:t>
-      </w:r>
-      <w:r>
-        <w:rPr>
-          <w:b w:val="0"/>
-        </w:rPr>
-        <w:t xml:space="preserve"> Full CI/CD verification: unit, integration, load/stress testing (50k+ eps), chaos engineering.</w:t>
-      </w:r>
-    </w:p>
-    <w:p>
-      <w:pPr>
-        <w:pStyle w:val="ListBullet"/>
-      </w:pPr>
-      <w:r>
-        <w:rPr>
-          <w:b w:val="0"/>
-        </w:rPr>
-      </w:r>
-      <w:r>
-        <w:rPr>
-          <w:b/>
-        </w:rPr>
-        <w:t>Documentation:</w:t>
-      </w:r>
-      <w:r>
-        <w:rPr>
-          <w:b w:val="0"/>
-        </w:rPr>
-        <w:t xml:space="preserve"> Architectural Design Records (ADRs), OpenAPI specs, disaster recovery runbooks, SLA/SLO definitions.</w:t>
-      </w:r>
-    </w:p>
-    <w:p>
-      <w:r>
-        <w:rPr>
-          <w:b w:val="0"/>
-        </w:rPr>
-      </w:r>
-      <w:r>
-        <w:rPr>
-          <w:b/>
-        </w:rPr>
-        <w:t>SecOps Example:</w:t>
-      </w:r>
-      <w:r>
-        <w:rPr>
-          <w:b w:val="0"/>
-        </w:rPr>
-        <w:t xml:space="preserve"> A global enterprise ingests 500,000 events/second from CloudTrail, CrowdStrike, Palo Alto</w:t>
-      </w:r>
-    </w:p>
-    <w:p>
-      <w:r>
-        <w:t>firewalls, and CoreDNS. An event-driven pipeline normalizes all inputs into OCSF JSON, runs real-time detection</w:t>
-      </w:r>
-    </w:p>
-    <w:p>
-      <w:r>
-        <w:t>models, flags anomalies to Kafka DLQs, and writes enriched events to a data lake for SIEM analytics.</w:t>
-      </w:r>
-    </w:p>
-    <w:p>
-      <w:r>
-        <w:t>---</w:t>
-      </w:r>
-    </w:p>
-    <w:p>
-      <w:pPr>
-        <w:pStyle w:val="Heading2"/>
-      </w:pPr>
-      <w:r>
-        <w:t>4. Escalation Criteria</w:t>
-      </w:r>
-    </w:p>
-    <w:p>
-      <w:r>
-        <w:t>| Dimension | Quick Scripts | Production Automation | Engineering Pipelines |</w:t>
-      </w:r>
-    </w:p>
-    <w:p>
-      <w:r>
-        <w:t>|---|---|---|---|</w:t>
-      </w:r>
-    </w:p>
-    <w:p>
-      <w:r>
-        <w:t>| Primary User | Individual Analyst | SOC Team | Enterprise SecOps / SIEM |</w:t>
-      </w:r>
-    </w:p>
-    <w:p>
-      <w:r>
-        <w:t>| Data Scale | &lt;10k events | 10k - 1M events | &gt;1M events/day streaming |</w:t>
-      </w:r>
-    </w:p>
-    <w:p>
-      <w:r>
-        <w:t>| Code Structure | Single file, procedural | Modular multi-file package | Microservices / Event-Driven |</w:t>
-      </w:r>
-    </w:p>
-    <w:p>
-      <w:r>
-        <w:t>| Error Handling | Crash on error | Skip &amp; warn defensively | DLQ, Retries, Circuit Breakers |</w:t>
-      </w:r>
-    </w:p>
-    <w:p>
-      <w:r>
-        <w:t>| Observability | print() only | Structured logging | Distributed Tracing + Prometheus |</w:t>
-      </w:r>
-    </w:p>
-    <w:p>
-      <w:r>
-        <w:t>| Testing | Manual ad-hoc | Automated pytest | Full CI/CD pipeline |</w:t>
-      </w:r>
-    </w:p>
-    <w:p>
-      <w:r>
-        <w:t>| Docs | Inline notes | README + CLI guides | ADRs, Runbooks, OpenAPI Specs |</w:t>
-      </w:r>
-    </w:p>
-    <w:p>
-      <w:r>
-        <w:rPr>
-          <w:b w:val="0"/>
-        </w:rPr>
-        <w:t xml:space="preserve">1. </w:t>
-      </w:r>
-      <w:r>
-        <w:rPr>
-          <w:b/>
-        </w:rPr>
-        <w:t>Escalate to Production Automation</w:t>
-      </w:r>
-      <w:r>
-        <w:rPr>
-          <w:b w:val="0"/>
-        </w:rPr>
-        <w:t xml:space="preserve"> when a script is shared, reused, or failure impacts team productivity.</w:t>
-      </w:r>
-    </w:p>
-    <w:p>
-      <w:r>
-        <w:rPr>
-          <w:b w:val="0"/>
-        </w:rPr>
-        <w:t xml:space="preserve">2. </w:t>
-      </w:r>
-      <w:r>
-        <w:rPr>
-          <w:b/>
-        </w:rPr>
-        <w:t>Escalate to Engineering Pipeline</w:t>
-      </w:r>
-      <w:r>
-        <w:rPr>
-          <w:b w:val="0"/>
-        </w:rPr>
-        <w:t xml:space="preserve"> when volume exceeds single-node limits, real-time latency is needed,</w:t>
-      </w:r>
-    </w:p>
-    <w:p>
-      <w:r>
-        <w:t>or outages violate enterprise SLAs.</w:t>
-      </w:r>
-    </w:p>
-    <w:p>
-      <w:r>
-        <w:t>---</w:t>
-      </w:r>
-    </w:p>
-    <w:p>
-      <w:r>
-        <w:t>*CipherFlow Security Engineering Documentation*</w:t>
+        <w:t>CipherFlow  ·  Security Data Engineering Pipeline  ·  Task 1 Design Memo  ·  MAFA  ·  July 2026</w:t>
       </w:r>
     </w:p>
     <w:sectPr>
       <w:pgSz w:w="12240" w:h="15840"/>
-      <w:pgMar w:top="1440" w:right="1440" w:bottom="1440" w:left="1440" w:header="720" w:footer="720" w:gutter="0"/>
+      <w:pgMar w:top="1008" w:right="1224" w:bottom="1008" w:left="1224" w:header="720" w:footer="720" w:gutter="0"/>
       <w:cols w:space="720"/>
       <w:docGrid w:linePitch="360"/>
     </w:sectPr>

</xml_diff>